<commit_message>
Ekler v4: Ek J.1 demo ekranları ve Ek K.2 sürücü görüş mektupları eklendi
- Ek J.1 Demo Uygulama Ekranları: 5 iPhone ekran görüntüsü ve açıklamaları
  yatay sayfada tek tablo; Ek-J J.11 sınırlılığı buna göre güncellendi.
- Ek K.2 Bireysel Sürücü Görüş Mektupları: 4 taranmış mektup, liste tablosu
  ve kapsam notu (şablon metin, taahhüt değil); Ek-K K.5 ve K.13'e atıf.
- İçindekiler 17 girişe çıkarıldı; kapak metni güncellendi.
- İş planı v2: 1.1, 1.2 ve 3.4'e Ek-J.1 / Ek-K.2 atıfları; karakter tablosu
  yeniden hesaplandı. v3 ekler dosyası v4 ile değiştirildi.

Co-Authored-By: Claude Fable 5.1 <noreply@anthropic.com>
Claude-Session: https://claude.ai/code/session_01AwTf83BnX7kzUJoCJvJBN3
</commit_message>
<xml_diff>
--- a/A/iş planı son hali v2.docx
+++ b/A/iş planı son hali v2.docx
@@ -264,7 +264,7 @@
               <w:t>Bugün:</w:t>
             </w:r>
             <w:r>
-              <w:t xml:space="preserve"> Kamuya açık sunucuda Kadıköy için canlı hizmet verilmekte; İstanbul geneli yol ağı kurulmuş olup bellek sınırı nedeniyle henüz canlı hizmette değildir (Ek-J). Rota çekirdeği referans algoritmayla 40/40, dönüş kısıtlı sürümü 30/30 sorguda aynı sonucu vermiş; yük testinde medyan yanıt süresi tek kullanıcıda 39 ms, 100 eşzamanlı kullanıcıda 2,5 saniye olmuştur (Ek-A). %80 kabul eşiğine göre THS 5 kriterlerinde %88 sağlanarak seviye tamamlanmış, THS 6 kriterlerinde ortalama %76 ilerlemeye ulaşılmıştır (Ek-B).</w:t>
+              <w:t xml:space="preserve"> Kamuya açık sunucuda Kadıköy için canlı hizmet verilmekte; İstanbul geneli yol ağı kurulmuş olup bellek sınırı nedeniyle henüz canlı hizmette değildir (Ek-J; demo ekranları Ek-J.1). Rota çekirdeği referans algoritmayla 40/40, dönüş kısıtlı sürümü 30/30 sorguda aynı sonucu vermiş; yük testinde medyan yanıt süresi tek kullanıcıda 39 ms, 100 eşzamanlı kullanıcıda 2,5 saniye olmuştur (Ek-A). %80 kabul eşiğine göre THS 5 kriterlerinde %88 sağlanarak seviye tamamlanmış, THS 6 kriterlerinde ortalama %76 ilerlemeye ulaşılmıştır (Ek-B).</w:t>
             </w:r>
           </w:p>
           <w:p>
@@ -397,7 +397,7 @@
           </w:p>
           <w:p>
             <w:r>
-              <w:t>Müşteri doğrulaması. Proje döneminde 15–20 kurye işletmesiyle keşif görüşmesi; en az 150 genel motosiklet sürücüsü ve ayrıca 100 esnaf/bağımsız kurye ile fiyatlama ve kullanım anketi yürütülecek; kullanım sıklığı, rota tercihleri, ödeme istekliliği ve kurumsal satın alma süreci doğrulanacaktır (bkz. 2.3, 4.2).</w:t>
+              <w:t>Müşteri doğrulaması. Proje döneminde 15–20 kurye işletmesiyle keşif görüşmesi; en az 150 genel motosiklet sürücüsü ve ayrıca 100 esnaf/bağımsız kurye ile fiyatlama ve kullanım anketi yürütülecek; kullanım sıklığı, rota tercihleri, ödeme istekliliği ve kurumsal satın alma süreci doğrulanacaktır (bkz. 2.3, 4.2). Haziran 2026 ön anketi (12 yanıt; Ek-K.1) ve Temmuz–Ağustos 2026’da üç bireysel sürücüden alınan dört görüş mektubu (Ek-K.2) ilk sinyallerdir; genellenebilir bulgu değildir.</w:t>
             </w:r>
           </w:p>
           <w:p/>
@@ -4101,7 +4101,7 @@
               <w:t>Mevcut durum.</w:t>
             </w:r>
             <w:r>
-              <w:t xml:space="preserve"> Akademik danışmanlık dışında bugün itibarıyla imzalanmış kurumsal pilot veya bağlayıcı işbirliği sözleşmesi bulunmamaktadır. Kurye işletmeleri, içerik üreticileri ve teknoloji paydaşlarıyla kayda geçmiş bir görüşme henüz yoktur; hedef liste ve görüşme planı Ek-K’da, Haziran 2026’daki 12 yanıtlı ön anket Ek-K.1’de sunulmuştur. Yalnız yazılı ve imzalı mutabakatlar resmî işbirliği olarak raporlanacaktır.</w:t>
+              <w:t xml:space="preserve"> Akademik danışmanlık dışında bugün itibarıyla imzalanmış kurumsal pilot veya bağlayıcı işbirliği sözleşmesi bulunmamaktadır. Kurye işletmeleri, içerik üreticileri ve teknoloji paydaşlarıyla kayda geçmiş bir görüşme henüz yoktur; hedef liste ve görüşme planı Ek-K’da, Haziran 2026’daki 12 yanıtlı ön anket Ek-K.1’de, Temmuz–Ağustos 2026’da alınan dört bireysel sürücü görüş mektubu Ek-K.2’de sunulmuştur. Yalnız yazılı ve imzalı mutabakatlar resmî işbirliği olarak raporlanacaktır.</w:t>
             </w:r>
           </w:p>
           <w:p/>
@@ -9034,7 +9034,7 @@
                 <w:sz w:val="17"/>
                 <w:szCs w:val="17"/>
               </w:rPr>
-              <w:t>2.616 / 3.000</w:t>
+              <w:t>2.639 / 3.000</w:t>
             </w:r>
           </w:p>
         </w:tc>
@@ -9149,7 +9149,7 @@
                 <w:sz w:val="17"/>
                 <w:szCs w:val="17"/>
               </w:rPr>
-              <w:t>2.536 / 3.000</w:t>
+              <w:t>2.710 / 3.000</w:t>
             </w:r>
           </w:p>
         </w:tc>
@@ -9779,7 +9779,7 @@
                 <w:sz w:val="17"/>
                 <w:szCs w:val="17"/>
               </w:rPr>
-              <w:t>2.614 / 3.000</w:t>
+              <w:t>2.690 / 3.000</w:t>
             </w:r>
           </w:p>
         </w:tc>
@@ -10602,6 +10602,23 @@
           <w:szCs w:val="18"/>
         </w:rPr>
         <w:t>4.5 ve 5.1: nakit pisti ifadesi Ek-E ile uyumlu (Ay 12 sonu; düz dağıtımda Ay 9; kritik nakit ayı Ay 13).</w:t>
+      </w:r>
+    </w:p>
+    <w:p>
+      <w:pPr>
+        <w:pStyle w:val="ListeParagraf"/>
+        <w:numPr>
+          <w:ilvl w:val="0"/>
+          <w:numId w:val="2"/>
+        </w:numPr>
+        <w:spacing w:after="60"/>
+      </w:pPr>
+      <w:r>
+        <w:rPr>
+          <w:sz w:val="18"/>
+          <w:szCs w:val="18"/>
+        </w:rPr>
+        <w:t>1.1, 1.2, 3.4: Ek-J.1 (demo uygulama ekranları) ve Ek-K.2 (bireysel sürücü görüş mektupları) atıfları eklendi.</w:t>
       </w:r>
     </w:p>
     <w:p>

</xml_diff>

<commit_message>
Waze ifadesi Ek-C ile uyumlu (plan 1.1, 1.5; PRODİS B.2, B.4); B.1 ekip paragrafı çıkarıldı
Co-Authored-By: Claude Fable 5.1 <noreply@anthropic.com>
Claude-Session: https://claude.ai/code/session_01AwTf83BnX7kzUJoCJvJBN3
</commit_message>
<xml_diff>
--- a/A/iş planı son hali v2.docx
+++ b/A/iş planı son hali v2.docx
@@ -240,7 +240,7 @@
               <w:t>Sorun:</w:t>
             </w:r>
             <w:r>
-              <w:t xml:space="preserve"> Türkiye’de Ağustos 2026 itibarıyla 7.608.433 motosiklet bulunmaktadır (taşıtların %21,8’i; TÜİK). İstanbul, INRIX 2025’e göre dünyanın en sıkışık kentidir. Türkiye’de yaygın kullanılan genel navigasyon uygulamaları ağırlıklı olarak otomobil odaklı rota ve süre hesaplamaktadır. Bu nedenle sıkışık trafikte gösterilen süre motosiklet için uzun, açık yolda ise düşük motor hacimli motosikletler için kısa kalabilmekte; önerilen rota motosiklet kullanımına uygun olmayan yollara sapabilmektedir (Ek-H). Google’ın iki tekerlekli rota hizmeti 40 ülkede, Waze’in motosiklet modu ise 13 Temmuz 2026’dan itibaren 7 ülkede sunulmaktadır; Türkiye Eylül 2026 itibarıyla her iki hizmetin duyurulan kapsamı dışındadır (Ek-C).</w:t>
+              <w:t xml:space="preserve"> Türkiye’de Ağustos 2026 itibarıyla 7.608.433 motosiklet bulunmaktadır (taşıtların %21,8’i; TÜİK). İstanbul, INRIX 2025’e göre dünyanın en sıkışık kentidir. Türkiye’de yaygın kullanılan genel navigasyon uygulamaları ağırlıklı olarak otomobil odaklı rota ve süre hesaplamaktadır. Bu nedenle sıkışık trafikte gösterilen süre motosiklet için uzun, açık yolda ise düşük motor hacimli motosikletler için kısa kalabilmekte; önerilen rota motosiklet kullanımına uygun olmayan yollara sapabilmektedir (Ek-H). Google’ın iki tekerlekli rota hizmeti 40 ülkede sunulmakta ve Türkiye’yi kapsamamaktadır; Waze’de 2017’den beri bulunan motosiklet araç türünün Türkiye’de kullanılabilirliği doğrulanamamış, 13 Temmuz 2026’da duyurulan yeni motosiklet modu ise 7 ülkeyle sınırlıdır (Ek-C).</w:t>
             </w:r>
           </w:p>
           <w:p>
@@ -847,7 +847,7 @@
               <w:t>Genel navigasyon.</w:t>
             </w:r>
             <w:r>
-              <w:t xml:space="preserve"> Google Haritalar, Apple Haritalar, Yandex ve Waze ücretsiz olmaları, yüksek marka bilinirlikleri ve geniş kullanıcı tabanları nedeniyle en güçlü dolaylı rakiplerdir. Google Routes API’nin iki tekerlekli modu Eylül 2026 itibarıyla 40 ülkede kullanılmakta, ancak Türkiye desteklenen ülkeler arasında yer almamaktadır. Waze ise 13 Temmuz 2026’da motosiklete özgü rota, ETA ve yol tehlikelerini içeren motosiklet modunu Arjantin, Brezilya, Kolombiya, Malezya, Meksika, Peru ve Filipinler’de kullanıma açmış ve kapsamın genişletileceğini duyurmuştur. Bu nedenle Waze, Türkiye’ye giriş ihtimali bakımından MotoMap’in önemli küresel rekabet baskılarından biridir.</w:t>
+              <w:t xml:space="preserve"> Google Haritalar, Apple Haritalar, Yandex ve Waze ücretsiz olmaları ve geniş kullanıcı tabanları nedeniyle en güçlü dolaylı rakiplerdir. Google Routes API’nin iki tekerlekli modu Eylül 2026 itibarıyla 40 ülkede kullanılmakta, ancak Türkiye desteklenen ülkeler arasında yer almamaktadır. Waze ise 13 Temmuz 2026’da motosiklete özgü rota, ETA ve yol tehlikelerini içeren motosiklet modunu Arjantin, Brezilya, Kolombiya, Malezya, Meksika, Peru ve Filipinler’de kullanıma açmış ve kapsamın genişletileceğini duyurmuştur. Waze’de 2017’den beri bulunan motosiklet araç türünün Türkiye’de kullanılabilirliği doğrulanmamıştır; Waze bu nedenle en yakın küresel rekabet baskısıdır (Ek-C).</w:t>
             </w:r>
           </w:p>
           <w:p>
@@ -871,7 +871,7 @@
               <w:t>Yerli doğrudan rakipler.</w:t>
             </w:r>
             <w:r>
-              <w:t xml:space="preserve"> Motoseyir ve MotoAtlas 2026’da pazara giren iki yerli üründür. Motoseyir motosiklete özel rota, grup sürüşü ve birden fazla hedef sıralama özellikleri sunmakta; Kurye Pro paketi aylık 99,99 TL’dir. MotoAtlas ise hızlı/dengeli/virajlı rota, sürüş kaydı ve topluluk özellikleriyle konumlanmakta; aylık üyeliği 119 TL’dir. Bu iki girişim özellikle Türkiye’de kullanıcı edinimi ve fiyatlama açısından doğrudan rekabet oluşturmaktadır (Ek-C).</w:t>
+              <w:t xml:space="preserve"> Motoseyir ve MotoAtlas 2026’da pazara giren iki yerli üründür. Motoseyir motosiklete özel rota, grup sürüşü ve birden fazla hedef sıralama özellikleri sunmakta; Kurye Pro paketi aylık 99,99 TL’dir. MotoAtlas ise hızlı/dengeli/virajlı rota, sürüş kaydı ve topluluk özellikleriyle konumlanmakta; aylık üyeliği 119 TL’dir. Bu iki girişim kullanıcı edinimi ve fiyatlama açısından doğrudan rakiptir (Ek-C).</w:t>
             </w:r>
           </w:p>
           <w:p>
@@ -9034,7 +9034,7 @@
                 <w:sz w:val="17"/>
                 <w:szCs w:val="17"/>
               </w:rPr>
-              <w:t>2.639 / 3.000</w:t>
+              <w:t>2.698 / 3.000</w:t>
             </w:r>
           </w:p>
         </w:tc>
@@ -9494,7 +9494,7 @@
                 <w:sz w:val="17"/>
                 <w:szCs w:val="17"/>
               </w:rPr>
-              <w:t>2.953 / 3.000</w:t>
+              <w:t>2.939 / 3.000</w:t>
             </w:r>
           </w:p>
         </w:tc>
@@ -10619,6 +10619,23 @@
           <w:szCs w:val="18"/>
         </w:rPr>
         <w:t>1.1, 1.2, 3.4: Ek-J.1 (demo uygulama ekranları) ve Ek-K.2 (bireysel sürücü görüş mektupları) atıfları eklendi.</w:t>
+      </w:r>
+    </w:p>
+    <w:p>
+      <w:pPr>
+        <w:pStyle w:val="ListeParagraf"/>
+        <w:numPr>
+          <w:ilvl w:val="0"/>
+          <w:numId w:val="2"/>
+        </w:numPr>
+        <w:spacing w:after="60"/>
+      </w:pPr>
+      <w:r>
+        <w:rPr>
+          <w:sz w:val="18"/>
+          <w:szCs w:val="18"/>
+        </w:rPr>
+        <w:t>1.1, 1.5: Waze ifadesi Ek-C ile uyumlu hâle getirildi (2017’den beri motosiklet araç türü; Türkiye’de kullanılabilirliği doğrulanmamış; 2026 modu yedi ülke).</w:t>
       </w:r>
     </w:p>
     <w:p>

</xml_diff>